<commit_message>
docs: profesyonel görsel sistemi (seaborn + plotly/kaleido) — 28 yüksek çözünürlüklü figür
- gen_figures.py: matplotlib/seaborn + plotly 6 + kaleido 0.2 ile tam yeniden yazım
  * Birleşik PALETTE tasarım sistemi, DPI=180 (mpl) ve scale=2 (plotly)
  * hex_to_rgba() yardımcı fonksiyonu, roadmap Gantt matplotlib'e taşındı
  * Tüm 28 görsel başarıyla üretildi (radar, harita, waterfall, Gantt dahil)
- compile_pdf.sh: venv python3 öncelikli çalıştırma, DOCX çıktısı eklendi
- Derleme: 140 sayfa PDF + DOCX (profesyonel görsellerle)

Co-Authored-By: Claude Sonnet 4.6 <noreply@anthropic.com>
</commit_message>
<xml_diff>
--- a/docs/thesis/teknofest2026_tez.docx
+++ b/docs/thesis/teknofest2026_tez.docx
@@ -9188,7 +9188,7 @@
       <w:r>
         <w:drawing>
           <wp:inline>
-            <wp:extent cx="4800600" cy="1502503"/>
+            <wp:extent cx="4800600" cy="2355472"/>
             <wp:effectExtent b="0" l="0" r="0" t="0"/>
             <wp:docPr descr="Tablo 8.1’de listelenecek temel KPI’lar:" title="" id="67" name="Picture"/>
             <a:graphic>
@@ -9209,7 +9209,7 @@
                   <pic:spPr bwMode="auto">
                     <a:xfrm>
                       <a:off x="0" y="0"/>
-                      <a:ext cx="4800600" cy="1502503"/>
+                      <a:ext cx="4800600" cy="2355472"/>
                     </a:xfrm>
                     <a:prstGeom prst="rect">
                       <a:avLst/>

</xml_diff>